<commit_message>
docs: standardize bus seat layout in AI training constraints and update SOP documentation
</commit_message>
<xml_diff>
--- a/QUY_TRINH_VAN_HANH_CHUAN_SOP_EASYTRIP.docx
+++ b/QUY_TRINH_VAN_HANH_CHUAN_SOP_EASYTRIP.docx
@@ -686,7 +686,35 @@
         <w:rPr>
           <w:rFonts w:ascii="Times New Roman" w:hAnsi="Times New Roman" w:cs="Times New Roman"/>
         </w:rPr>
-        <w:t>3. Gửi sơ đồ cho khách và hướng dẫn: Dãy bên trái là Tầng dưới (A1 - A20); Dãy bên phải là Tầng trên (B1 - B20).</w:t>
+        <w:t>3. Gửi sơ đồ cho khách và hướng dẫn cấu trúc ghế xe buýt:</w:t>
+      </w:r>
+    </w:p>
+    <w:p>
+      <w:r>
+        <w:rPr>
+          <w:rFonts w:ascii="Times New Roman" w:hAnsi="Times New Roman" w:cs="Times New Roman"/>
+          <w:b/>
+          <w:color w:val="003366"/>
+        </w:rPr>
+        <w:t>• TẦNG DƯỚI (Dãy số LẺ): Gồm các cabin A1, B1, A3, B3, A5, B5, A7, B7, A9, B9, A11 (Cuối tầng dưới có Nhà vệ sinh WC cạnh A11).</w:t>
+      </w:r>
+    </w:p>
+    <w:p>
+      <w:r>
+        <w:rPr>
+          <w:rFonts w:ascii="Times New Roman" w:hAnsi="Times New Roman" w:cs="Times New Roman"/>
+          <w:b/>
+          <w:color w:val="B22222"/>
+        </w:rPr>
+        <w:t>• TẦNG TRÊN (Dãy số CHẴN): Gồm các cabin A2, B2, A4, B4, A6, B6, A8, B8, A10, B10, A12 (Ghế A12 dài 160cm, các ghế khác tiêu chuẩn 180cm).</w:t>
+      </w:r>
+    </w:p>
+    <w:p>
+      <w:r>
+        <w:rPr>
+          <w:rFonts w:ascii="Times New Roman" w:hAnsi="Times New Roman" w:cs="Times New Roman"/>
+        </w:rPr>
+        <w:t>• Phân luồng dãy: Dãy A nằm bên trái (phía tài xế), Dãy B nằm bên phải (phía cửa lên xuống).</w:t>
       </w:r>
     </w:p>
     <w:p>

</xml_diff>